<commit_message>
Book 7 v1.0 RC1: final run with the cover sheet; book, manual and cover regenerated
- Scenario rerun on the 41-sheet model; Excel quoting restored (10,909
  formulas); strict Excel-grammar load OK; COVER live status STOP, 6 of 23,
  ALL OK, ALL PASS
- A4, Word and 7 x 10 in editions, Manual 7 PDF and Word, KDP cover rebuilt

Co-Authored-By: Claude Opus 5.5 <noreply@anthropic.com>
Claude-Session: https://claude.ai/code/session_015weavXoVLwkjwEeCevNZ86
</commit_message>
<xml_diff>
--- a/manual/build/MANUAL7_User_and_Methodology.docx
+++ b/manual/build/MANUAL7_User_and_Methodology.docx
@@ -3163,7 +3163,7 @@
       </w:pPr>
       <w:r>
         <w:rPr/>
-        <w:t xml:space="preserve">All 40 sheets, grouped as on </w:t>
+        <w:t xml:space="preserve">All 41 sheets: the cover sheet, then the 40 working sheets grouped as on </w:t>
       </w:r>
       <w:r>
         <w:rPr>
@@ -3252,7 +3252,7 @@
                 <w:color w:val="1D1D1D"/>
                 <w:sz w:val="16"/>
               </w:rPr>
-              <w:t>00_README</w:t>
+              <w:t>COVER</w:t>
             </w:r>
           </w:p>
         </w:tc>
@@ -3269,7 +3269,7 @@
                 <w:color w:val="1D1D1D"/>
                 <w:sz w:val="16"/>
               </w:rPr>
-              <w:t>Purpose, philosophy, users, colour code, units, circularity, versions, limitations, sheet map</w:t>
+              <w:t>Title, version, live status (close decision, gates met, 9-gate screen, fiscal screen, checks, book check) and links to the main sheets</w:t>
             </w:r>
           </w:p>
         </w:tc>
@@ -3289,7 +3289,7 @@
                 <w:color w:val="1D1D1D"/>
                 <w:sz w:val="16"/>
               </w:rPr>
-              <w:t>01_CONTROL_PANEL</w:t>
+              <w:t>00_README</w:t>
             </w:r>
           </w:p>
         </w:tc>
@@ -3307,7 +3307,7 @@
                 <w:color w:val="1D1D1D"/>
                 <w:sz w:val="16"/>
               </w:rPr>
-              <w:t>Case, generation case, lender case, structure, debt mode, budget backstop, nine stress toggles, five flexes, and an active-scenario read-out</w:t>
+              <w:t>Purpose, philosophy, users, colour code, units, circularity, versions, limitations, sheet map</w:t>
             </w:r>
           </w:p>
         </w:tc>
@@ -3326,6 +3326,43 @@
                 <w:color w:val="1D1D1D"/>
                 <w:sz w:val="16"/>
               </w:rPr>
+              <w:t>01_CONTROL_PANEL</w:t>
+            </w:r>
+          </w:p>
+        </w:tc>
+        <w:tc>
+          <w:tcPr>
+            <w:tcW w:type="dxa" w:w="7609"/>
+          </w:tcPr>
+          <w:p>
+            <w:pPr>
+              <w:spacing w:after="0"/>
+            </w:pPr>
+            <w:r>
+              <w:rPr>
+                <w:color w:val="1D1D1D"/>
+                <w:sz w:val="16"/>
+              </w:rPr>
+              <w:t>Case, generation case, lender case, structure, debt mode, budget backstop, nine stress toggles, five flexes, and an active-scenario read-out</w:t>
+            </w:r>
+          </w:p>
+        </w:tc>
+      </w:tr>
+      <w:tr>
+        <w:tc>
+          <w:tcPr>
+            <w:tcW w:type="dxa" w:w="2029"/>
+            <w:shd w:val="clear" w:color="auto" w:fill="FAF8F2"/>
+          </w:tcPr>
+          <w:p>
+            <w:pPr>
+              <w:spacing w:after="0"/>
+            </w:pPr>
+            <w:r>
+              <w:rPr>
+                <w:color w:val="1D1D1D"/>
+                <w:sz w:val="16"/>
+              </w:rPr>
               <w:t>01A_DEVELOPMENT</w:t>
             </w:r>
           </w:p>
@@ -3333,6 +3370,7 @@
         <w:tc>
           <w:tcPr>
             <w:tcW w:type="dxa" w:w="7609"/>
+            <w:shd w:val="clear" w:color="auto" w:fill="FAF8F2"/>
           </w:tcPr>
           <w:p>
             <w:pPr>

</xml_diff>